<commit_message>
Add Review 1 and Review 2 reports, terminal screenshots, live demo output
</commit_message>
<xml_diff>
--- a/docs/Review2/Review2_Report.docx
+++ b/docs/Review2/Review2_Report.docx
@@ -31865,6 +31865,59 @@
       </w:pPr>
       <w:r>
         <w:t xml:space="preserve">9. Source Code Repository</w:t>
+      </w:r>
+    </w:p>
+    <w:p>
+      <w:pPr>
+        <w:spacing w:after="120" w:line="276"/>
+      </w:pPr>
+      <w:r>
+        <w:rPr>
+          <w:rFonts w:ascii="Calibri" w:cs="Calibri" w:eastAsia="Calibri" w:hAnsi="Calibri"/>
+          <w:b/>
+          <w:bCs/>
+          <w:sz w:val="22"/>
+          <w:szCs w:val="22"/>
+        </w:rPr>
+        <w:t xml:space="preserve">Repository:</w:t>
+      </w:r>
+      <w:r>
+        <w:rPr>
+          <w:rFonts w:ascii="Calibri" w:cs="Calibri" w:eastAsia="Calibri" w:hAnsi="Calibri"/>
+          <w:sz w:val="22"/>
+          <w:szCs w:val="22"/>
+        </w:rPr>
+        <w:t xml:space="preserve"> https://github.com/malikabalaji/gym-membership-db</w:t>
+      </w:r>
+    </w:p>
+    <w:p>
+      <w:pPr>
+        <w:spacing w:after="120" w:line="276"/>
+      </w:pPr>
+      <w:r>
+        <w:rPr>
+          <w:rFonts w:ascii="Calibri" w:cs="Calibri" w:eastAsia="Calibri" w:hAnsi="Calibri"/>
+          <w:sz w:val="22"/>
+          <w:szCs w:val="22"/>
+        </w:rPr>
+        <w:t xml:space="preserve">The repository holds the complete source code, sample data, tests, the live demonstration output (</w:t>
+      </w:r>
+      <w:r>
+        <w:rPr>
+          <w:rFonts w:ascii="Consolas" w:cs="Consolas" w:eastAsia="Consolas" w:hAnsi="Consolas"/>
+          <w:color w:val="7A2E0E"/>
+          <w:sz w:val="19"/>
+          <w:szCs w:val="19"/>
+        </w:rPr>
+        <w:t xml:space="preserve">demo_output.txt</w:t>
+      </w:r>
+      <w:r>
+        <w:rPr>
+          <w:rFonts w:ascii="Calibri" w:cs="Calibri" w:eastAsia="Calibri" w:hAnsi="Calibri"/>
+          <w:sz w:val="22"/>
+          <w:szCs w:val="22"/>
+        </w:rPr>
+        <w:t xml:space="preserve">), the Review 1 and Review 2 reports, and the terminal screenshots from the live run.</w:t>
       </w:r>
     </w:p>
     <w:p>

</xml_diff>